<commit_message>
Remove difficulty from questions
Gone from the question form, bank, filters, random pick, assessment views and the Word import/template.
The database column stays (defaults to medium) so no data is touched; a stray Level line in a Word file is ignored.

Co-Authored-By: Claude Sonnet 5.5 <noreply@anthropic.com>
Claude-Session: https://claude.ai/code/session_01S2GmoShaCxPNxrFozGqiBH
</commit_message>
<xml_diff>
--- a/apps/web/public/templates/question-template.docx
+++ b/apps/web/public/templates/question-template.docx
@@ -52,7 +52,7 @@
         <w:pStyle w:val="ListBullet"/>
       </w:pPr>
       <w:r>
-        <w:t>Optional lines: "Marks: 2" (default 1), "Level: easy / medium / hard" (default medium), "Topic: ..." and "Explanation: ..." (shown to staff only).</w:t>
+        <w:t>Optional lines: "Marks: 2" (default 1), "Topic: ..." and "Explanation: ..." (shown to staff only).</w:t>
       </w:r>
     </w:p>
     <w:p>
@@ -132,11 +132,6 @@
     </w:p>
     <w:p>
       <w:r>
-        <w:t>Level: easy</w:t>
-      </w:r>
-    </w:p>
-    <w:p>
-      <w:r>
         <w:t>Topic: AVSEC</w:t>
       </w:r>
     </w:p>
@@ -183,11 +178,6 @@
     </w:p>
     <w:p>
       <w:r>
-        <w:t>Level: medium</w:t>
-      </w:r>
-    </w:p>
-    <w:p>
-      <w:r>
         <w:t>Topic: SMS</w:t>
       </w:r>
     </w:p>
@@ -230,11 +220,6 @@
     </w:p>
     <w:p>
       <w:r>
-        <w:t>Level: easy</w:t>
-      </w:r>
-    </w:p>
-    <w:p>
-      <w:r>
         <w:t>Topic: ARFF</w:t>
       </w:r>
     </w:p>
@@ -252,11 +237,6 @@
     <w:p>
       <w:r>
         <w:t>Marks: 10</w:t>
-      </w:r>
-    </w:p>
-    <w:p>
-      <w:r>
-        <w:t>Level: hard</w:t>
       </w:r>
     </w:p>
     <w:p>

</xml_diff>